<commit_message>
release prep: citation metadata, PDF manuscript, preprint package, LessWrong-ready writeup
Co-Authored-By: Claude Fable 5.1 <noreply@anthropic.com>
</commit_message>
<xml_diff>
--- a/docs/Methodology_APA.docx
+++ b/docs/Methodology_APA.docx
@@ -45,7 +45,7 @@
           <w:color w:val="000000"/>
           <w:sz w:val="24"/>
         </w:rPr>
-        <w:t xml:space="preserve">Berfay Hunalp</w:t>
+        <w:t xml:space="preserve">Berfay Hunalp, independent researcher, Nice, France (ibhunalp@gmail.com)</w:t>
       </w:r>
     </w:p>
     <w:p>
@@ -60,7 +60,7 @@
           <w:color w:val="000000"/>
           <w:sz w:val="24"/>
         </w:rPr>
-        <w:t xml:space="preserve">16 September 2026 (pre-registration frozen at git tag prereg-v1; data collected the same day)</w:t>
+        <w:t xml:space="preserve">16 September 2026. Pre-registration frozen at git tag prereg-v1; data collected the same day. Code, prompts, raw responses and analysis: https://github.com/BerfayHunalp/sycophancy-eval</w:t>
       </w:r>
     </w:p>
     <w:p>
@@ -2620,7 +2620,7 @@
           <w:color w:val="000000"/>
           <w:sz w:val="24"/>
         </w:rPr>
-        <w:t xml:space="preserve">on 16 September 2026 before any model call. The following implementation choices were made after the tag but before the full run, and none changes a hypothesis or a test: (a) items are downloaded from the Hub’s parquet export rather than paged through the datasets-server API (same rows, same indices); (b) the manipulation check administers one item per call instead of two item orders, which makes order moot; (c) the reasoning-effort setting applies only to the OpenAI model, for the reason given above; (d) the token budgets and the one-retry rule for cut-off replies were set after the pilot revealed that reasoning tokens count against the budget; (e) the 10 pilot items are retained.</w:t>
+        <w:t xml:space="preserve">on 16 September 2026 before any model call; the frozen text is at https://github.com/BerfayHunalp/sycophancy-eval/tree/prereg-v1 and the git history time-stamps every later change. The following implementation choices were made after the tag but before the full run, and none changes a hypothesis or a test: (a) items are downloaded from the Hub’s parquet export rather than paged through the datasets-server API (same rows, same indices); (b) the manipulation check administers one item per call instead of two item orders, which makes order moot; (c) the reasoning-effort setting applies only to the OpenAI model, for the reason given above; (d) the token budgets and the one-retry rule for cut-off replies were set after the pilot revealed that reasoning tokens count against the budget; (e) the 10 pilot items are retained.</w:t>
       </w:r>
     </w:p>
     <w:bookmarkEnd w:id="25"/>

</xml_diff>